<commit_message>
Tie overview back to the thesis theme
Co-Authored-By: Claude Opus 5.5 <noreply@anthropic.com>
Claude-Session: https://claude.ai/code/session_01UunSGkA7xxcu1ZJiDN1zG2
</commit_message>
<xml_diff>
--- a/output/卒論の概要.docx
+++ b/output/卒論の概要.docx
@@ -69,7 +69,7 @@
         <w:ind w:firstLine="210"/>
       </w:pPr>
       <w:r>
-        <w:t xml:space="preserve">筆者がフィジーとベトナムの留学で経験した異文化の衝突と、それを「やったことリスト」などの工夫でどう乗り越えたのか（乗り越えられなかったときはどう向き合ったのか）を明らかにする研究です。その結果を、これから留学する人がそのまま使える「やったことリスト」のテンプレートと、衝突の種類ごとの「向き合い方の早見表」としてまとめます。</w:t>
+        <w:t xml:space="preserve">留学先で異文化に戸惑った人が、どのような過程を経て、その文化を「楽しめる」ようになるのかを明らかにする研究です。筆者のフィジーとベトナムでの経験をもとに、戸惑い→衝突→適応→楽しさという異文化適応のプロセスをたどり、その中で「文化を楽しむ力」がどう育つのかを描きます。特に、筆者がその力を育てるきっかけになった「やったことリスト」に注目し、これから留学する人が使える形にまとめます。</w:t>
       </w:r>
     </w:p>
     <w:p>
@@ -113,7 +113,7 @@
         <w:ind w:firstLine="210"/>
       </w:pPr>
       <w:r>
-        <w:t xml:space="preserve">留学中に新しく挑戦したことを、一つずつ書き留めていくリストです。例えば、三食カレーが続いて飽きそうになったときに、ホストファミリーからスパイスの効能を教わり、自分で配合を試したことを記録しました。書き続けることで、自分ができるようになったことが目に見えるようになり、戸惑いを前向きな挑戦として捉え直すきっかけになりました。本研究では、このリストがなぜ異文化への適応を助けるのかを考え、誰でも使える形にします。</w:t>
+        <w:t xml:space="preserve">留学中に新しく挑戦したことを、一つずつ書き留めていくリストです。例えば、三食カレーが続いて飽きそうになったときに、ホストファミリーからスパイスの効能を教わり、自分で配合を試したことを記録しました。書き続けることで、自分ができるようになったことが目に見えるようになり、戸惑いを前向きな挑戦として捉え直すきっかけになりました。このように「やったことリスト」は、戸惑いを楽しさに変え、「文化を楽しむ力」を育てる道具になったと考えられます。本研究では、このリストが異文化適応のどの段階で、どのように役立ったのかを明らかにし、誰でも使える形にします。</w:t>
       </w:r>
     </w:p>
     <w:tbl>
@@ -593,7 +593,7 @@
         <w:spacing w:after="80" w:line="340"/>
       </w:pPr>
       <w:r>
-        <w:t xml:space="preserve">「やったことリスト」という、筆者自身が実際に使った工夫を、誰でも使える形にして示す</w:t>
+        <w:t xml:space="preserve">「文化を楽しむ力」がどう育つのかを、筆者の「やったことリスト」という具体的な工夫を通して示す</w:t>
       </w:r>
     </w:p>
     <w:p>
@@ -650,7 +650,7 @@
         <w:ind w:firstLine="210"/>
       </w:pPr>
       <w:r>
-        <w:t xml:space="preserve">卒論の最後に、次の2つを付録として付けます。</w:t>
+        <w:t xml:space="preserve">これから留学する人が「文化を楽しむ力」を育てられるように、卒論の最後に次の2つを付録として付けます。</w:t>
       </w:r>
     </w:p>
     <w:p>
@@ -690,7 +690,7 @@
         <w:t xml:space="preserve">向き合い方の早見表</w:t>
       </w:r>
       <w:r>
-        <w:t xml:space="preserve">：衝突の種類ごとに、試せる工夫と、受け入れられないときの向き合い方をまとめた表</w:t>
+        <w:t xml:space="preserve">：衝突の種類ごとに、楽しむための工夫と、受け入れられないときの向き合い方をまとめた表</w:t>
       </w:r>
     </w:p>
     <w:tbl>
@@ -807,7 +807,7 @@
                 <w:sz w:val="19"/>
                 <w:szCs w:val="19"/>
               </w:rPr>
-              <w:t xml:space="preserve">試せる工夫</w:t>
+              <w:t xml:space="preserve">楽しむための工夫</w:t>
             </w:r>
           </w:p>
         </w:tc>
@@ -1098,7 +1098,7 @@
         <w:ind w:firstLine="210"/>
       </w:pPr>
       <w:r>
-        <w:t xml:space="preserve">「全部を受け入れなくてもよい」という考え方も含めて示すことで、楽しめなかった人にも役立つ形にします。</w:t>
+        <w:t xml:space="preserve">「文化を楽しむ力」は、全部を好きになる力ではありません。「全部を受け入れなくてもよい」という考え方も含めて示すことで、楽しめなかった人にも役立つ形にします。</w:t>
       </w:r>
     </w:p>
     <w:p>

</xml_diff>

<commit_message>
Add ways of facing other cultures to overview
Co-Authored-By: Claude Opus 5.5 <noreply@anthropic.com>
Claude-Session: https://claude.ai/code/session_01UunSGkA7xxcu1ZJiDN1zG2
</commit_message>
<xml_diff>
--- a/output/卒論の概要.docx
+++ b/output/卒論の概要.docx
@@ -69,7 +69,7 @@
         <w:ind w:firstLine="210"/>
       </w:pPr>
       <w:r>
-        <w:t xml:space="preserve">留学先で異文化に戸惑った人が、どのような過程を経て、その文化を「楽しめる」ようになるのかを明らかにする研究です。筆者のフィジーとベトナムでの経験をもとに、戸惑い→衝突→適応→楽しさという異文化適応のプロセスをたどり、その中で「文化を楽しむ力」がどう育つのかを描きます。特に、筆者がその力を育てるきっかけになった「やったことリスト」に注目し、これから留学する人が使える形にまとめます。</w:t>
+        <w:t xml:space="preserve">留学先で異文化に戸惑った人が、どのような過程を経て、その文化を「楽しめる」ようになるのかを明らかにする研究です。筆者のフィジーとベトナムでの経験をもとに、戸惑い→衝突→適応→楽しさという異文化適応のプロセスをたどり、その中で「文化を楽しむ力」がどう育つのか、そして異文化とどのように向き合えばよいのかを描きます。特に、筆者がその力を育てるきっかけになった「やったことリスト」に注目し、これから留学する人が使える形にまとめます。</w:t>
       </w:r>
     </w:p>
     <w:p>
@@ -567,6 +567,529 @@
           <w:sz w:val="28"/>
           <w:szCs w:val="28"/>
         </w:rPr>
+        <w:t xml:space="preserve">異文化への向き合い方</w:t>
+      </w:r>
+    </w:p>
+    <w:p>
+      <w:pPr>
+        <w:spacing w:after="120" w:line="360"/>
+        <w:ind w:firstLine="210"/>
+      </w:pPr>
+      <w:r>
+        <w:t xml:space="preserve">異文化との向き合い方は、「楽しむ」だけではありません。本研究では、異文化への向き合い方を次の4つに分けて考えます。</w:t>
+      </w:r>
+    </w:p>
+    <w:tbl>
+      <w:tblPr>
+        <w:tblW w:type="dxa" w:w="9070"/>
+        <w:tblBorders>
+          <w:top w:val="single" w:color="auto" w:sz="4"/>
+          <w:left w:val="single" w:color="auto" w:sz="4"/>
+          <w:bottom w:val="single" w:color="auto" w:sz="4"/>
+          <w:right w:val="single" w:color="auto" w:sz="4"/>
+          <w:insideH w:val="single" w:color="auto" w:sz="4"/>
+          <w:insideV w:val="single" w:color="auto" w:sz="4"/>
+        </w:tblBorders>
+      </w:tblPr>
+      <w:tblGrid>
+        <w:gridCol w:w="2123"/>
+        <w:gridCol w:w="3088"/>
+        <w:gridCol w:w="3859"/>
+      </w:tblGrid>
+      <w:tr>
+        <w:trPr>
+          <w:tblHeader/>
+        </w:trPr>
+        <w:tc>
+          <w:tcPr>
+            <w:tcW w:type="dxa" w:w="2123"/>
+            <w:tcBorders>
+              <w:top w:val="single" w:color="999999" w:sz="4"/>
+              <w:left w:val="single" w:color="999999" w:sz="4"/>
+              <w:bottom w:val="single" w:color="999999" w:sz="4"/>
+              <w:right w:val="single" w:color="999999" w:sz="4"/>
+            </w:tcBorders>
+            <w:shd w:fill="EDEDED" w:color="auto" w:val="clear"/>
+            <w:tcMar>
+              <w:top w:type="dxa" w:w="60"/>
+              <w:left w:type="dxa" w:w="100"/>
+              <w:bottom w:type="dxa" w:w="60"/>
+              <w:right w:type="dxa" w:w="100"/>
+            </w:tcMar>
+          </w:tcPr>
+          <w:p>
+            <w:pPr>
+              <w:spacing w:line="280"/>
+            </w:pPr>
+            <w:r>
+              <w:rPr>
+                <w:b/>
+                <w:bCs/>
+                <w:sz w:val="19"/>
+                <w:szCs w:val="19"/>
+              </w:rPr>
+              <w:t xml:space="preserve">向き合い方</w:t>
+            </w:r>
+          </w:p>
+        </w:tc>
+        <w:tc>
+          <w:tcPr>
+            <w:tcW w:type="dxa" w:w="3088"/>
+            <w:tcBorders>
+              <w:top w:val="single" w:color="999999" w:sz="4"/>
+              <w:left w:val="single" w:color="999999" w:sz="4"/>
+              <w:bottom w:val="single" w:color="999999" w:sz="4"/>
+              <w:right w:val="single" w:color="999999" w:sz="4"/>
+            </w:tcBorders>
+            <w:shd w:fill="EDEDED" w:color="auto" w:val="clear"/>
+            <w:tcMar>
+              <w:top w:type="dxa" w:w="60"/>
+              <w:left w:type="dxa" w:w="100"/>
+              <w:bottom w:type="dxa" w:w="60"/>
+              <w:right w:type="dxa" w:w="100"/>
+            </w:tcMar>
+          </w:tcPr>
+          <w:p>
+            <w:pPr>
+              <w:spacing w:line="280"/>
+            </w:pPr>
+            <w:r>
+              <w:rPr>
+                <w:b/>
+                <w:bCs/>
+                <w:sz w:val="19"/>
+                <w:szCs w:val="19"/>
+              </w:rPr>
+              <w:t xml:space="preserve">内容</w:t>
+            </w:r>
+          </w:p>
+        </w:tc>
+        <w:tc>
+          <w:tcPr>
+            <w:tcW w:type="dxa" w:w="3859"/>
+            <w:tcBorders>
+              <w:top w:val="single" w:color="999999" w:sz="4"/>
+              <w:left w:val="single" w:color="999999" w:sz="4"/>
+              <w:bottom w:val="single" w:color="999999" w:sz="4"/>
+              <w:right w:val="single" w:color="999999" w:sz="4"/>
+            </w:tcBorders>
+            <w:shd w:fill="EDEDED" w:color="auto" w:val="clear"/>
+            <w:tcMar>
+              <w:top w:type="dxa" w:w="60"/>
+              <w:left w:type="dxa" w:w="100"/>
+              <w:bottom w:type="dxa" w:w="60"/>
+              <w:right w:type="dxa" w:w="100"/>
+            </w:tcMar>
+          </w:tcPr>
+          <w:p>
+            <w:pPr>
+              <w:spacing w:line="280"/>
+            </w:pPr>
+            <w:r>
+              <w:rPr>
+                <w:b/>
+                <w:bCs/>
+                <w:sz w:val="19"/>
+                <w:szCs w:val="19"/>
+              </w:rPr>
+              <w:t xml:space="preserve">例</w:t>
+            </w:r>
+          </w:p>
+        </w:tc>
+      </w:tr>
+      <w:tr>
+        <w:trPr>
+          <w:cantSplit/>
+        </w:trPr>
+        <w:tc>
+          <w:tcPr>
+            <w:tcW w:type="dxa" w:w="2123"/>
+            <w:tcBorders>
+              <w:top w:val="single" w:color="999999" w:sz="4"/>
+              <w:left w:val="single" w:color="999999" w:sz="4"/>
+              <w:bottom w:val="single" w:color="999999" w:sz="4"/>
+              <w:right w:val="single" w:color="999999" w:sz="4"/>
+            </w:tcBorders>
+            <w:tcMar>
+              <w:top w:type="dxa" w:w="60"/>
+              <w:left w:type="dxa" w:w="100"/>
+              <w:bottom w:type="dxa" w:w="60"/>
+              <w:right w:type="dxa" w:w="100"/>
+            </w:tcMar>
+          </w:tcPr>
+          <w:p>
+            <w:pPr>
+              <w:spacing w:line="280"/>
+            </w:pPr>
+            <w:r>
+              <w:rPr>
+                <w:sz w:val="19"/>
+                <w:szCs w:val="19"/>
+              </w:rPr>
+              <w:t xml:space="preserve">楽しむ</w:t>
+            </w:r>
+          </w:p>
+        </w:tc>
+        <w:tc>
+          <w:tcPr>
+            <w:tcW w:type="dxa" w:w="3088"/>
+            <w:tcBorders>
+              <w:top w:val="single" w:color="999999" w:sz="4"/>
+              <w:left w:val="single" w:color="999999" w:sz="4"/>
+              <w:bottom w:val="single" w:color="999999" w:sz="4"/>
+              <w:right w:val="single" w:color="999999" w:sz="4"/>
+            </w:tcBorders>
+            <w:tcMar>
+              <w:top w:type="dxa" w:w="60"/>
+              <w:left w:type="dxa" w:w="100"/>
+              <w:bottom w:type="dxa" w:w="60"/>
+              <w:right w:type="dxa" w:w="100"/>
+            </w:tcMar>
+          </w:tcPr>
+          <w:p>
+            <w:pPr>
+              <w:spacing w:line="280"/>
+            </w:pPr>
+            <w:r>
+              <w:rPr>
+                <w:sz w:val="19"/>
+                <w:szCs w:val="19"/>
+              </w:rPr>
+              <w:t xml:space="preserve">違いが興味や喜びに変わる</w:t>
+            </w:r>
+          </w:p>
+        </w:tc>
+        <w:tc>
+          <w:tcPr>
+            <w:tcW w:type="dxa" w:w="3859"/>
+            <w:tcBorders>
+              <w:top w:val="single" w:color="999999" w:sz="4"/>
+              <w:left w:val="single" w:color="999999" w:sz="4"/>
+              <w:bottom w:val="single" w:color="999999" w:sz="4"/>
+              <w:right w:val="single" w:color="999999" w:sz="4"/>
+            </w:tcBorders>
+            <w:tcMar>
+              <w:top w:type="dxa" w:w="60"/>
+              <w:left w:type="dxa" w:w="100"/>
+              <w:bottom w:type="dxa" w:w="60"/>
+              <w:right w:type="dxa" w:w="100"/>
+            </w:tcMar>
+          </w:tcPr>
+          <w:p>
+            <w:pPr>
+              <w:spacing w:line="280"/>
+            </w:pPr>
+            <w:r>
+              <w:rPr>
+                <w:sz w:val="19"/>
+                <w:szCs w:val="19"/>
+              </w:rPr>
+              <w:t xml:space="preserve">スパイスの配合を試し、カレーを楽しめるようになる</w:t>
+            </w:r>
+          </w:p>
+        </w:tc>
+      </w:tr>
+      <w:tr>
+        <w:trPr>
+          <w:cantSplit/>
+        </w:trPr>
+        <w:tc>
+          <w:tcPr>
+            <w:tcW w:type="dxa" w:w="2123"/>
+            <w:tcBorders>
+              <w:top w:val="single" w:color="999999" w:sz="4"/>
+              <w:left w:val="single" w:color="999999" w:sz="4"/>
+              <w:bottom w:val="single" w:color="999999" w:sz="4"/>
+              <w:right w:val="single" w:color="999999" w:sz="4"/>
+            </w:tcBorders>
+            <w:tcMar>
+              <w:top w:type="dxa" w:w="60"/>
+              <w:left w:type="dxa" w:w="100"/>
+              <w:bottom w:type="dxa" w:w="60"/>
+              <w:right w:type="dxa" w:w="100"/>
+            </w:tcMar>
+          </w:tcPr>
+          <w:p>
+            <w:pPr>
+              <w:spacing w:line="280"/>
+            </w:pPr>
+            <w:r>
+              <w:rPr>
+                <w:sz w:val="19"/>
+                <w:szCs w:val="19"/>
+              </w:rPr>
+              <w:t xml:space="preserve">受け入れる</w:t>
+            </w:r>
+          </w:p>
+        </w:tc>
+        <w:tc>
+          <w:tcPr>
+            <w:tcW w:type="dxa" w:w="3088"/>
+            <w:tcBorders>
+              <w:top w:val="single" w:color="999999" w:sz="4"/>
+              <w:left w:val="single" w:color="999999" w:sz="4"/>
+              <w:bottom w:val="single" w:color="999999" w:sz="4"/>
+              <w:right w:val="single" w:color="999999" w:sz="4"/>
+            </w:tcBorders>
+            <w:tcMar>
+              <w:top w:type="dxa" w:w="60"/>
+              <w:left w:type="dxa" w:w="100"/>
+              <w:bottom w:type="dxa" w:w="60"/>
+              <w:right w:type="dxa" w:w="100"/>
+            </w:tcMar>
+          </w:tcPr>
+          <w:p>
+            <w:pPr>
+              <w:spacing w:line="280"/>
+            </w:pPr>
+            <w:r>
+              <w:rPr>
+                <w:sz w:val="19"/>
+                <w:szCs w:val="19"/>
+              </w:rPr>
+              <w:t xml:space="preserve">好きにはならないが、納得して受け入れる</w:t>
+            </w:r>
+          </w:p>
+        </w:tc>
+        <w:tc>
+          <w:tcPr>
+            <w:tcW w:type="dxa" w:w="3859"/>
+            <w:tcBorders>
+              <w:top w:val="single" w:color="999999" w:sz="4"/>
+              <w:left w:val="single" w:color="999999" w:sz="4"/>
+              <w:bottom w:val="single" w:color="999999" w:sz="4"/>
+              <w:right w:val="single" w:color="999999" w:sz="4"/>
+            </w:tcBorders>
+            <w:tcMar>
+              <w:top w:type="dxa" w:w="60"/>
+              <w:left w:type="dxa" w:w="100"/>
+              <w:bottom w:type="dxa" w:w="60"/>
+              <w:right w:type="dxa" w:w="100"/>
+            </w:tcMar>
+          </w:tcPr>
+          <w:p>
+            <w:pPr>
+              <w:spacing w:line="280"/>
+            </w:pPr>
+            <w:r>
+              <w:rPr>
+                <w:sz w:val="19"/>
+                <w:szCs w:val="19"/>
+              </w:rPr>
+              <w:t xml:space="preserve">手で食べる習慣に慣れ、自分もそうして食べる</w:t>
+            </w:r>
+          </w:p>
+        </w:tc>
+      </w:tr>
+      <w:tr>
+        <w:trPr>
+          <w:cantSplit/>
+        </w:trPr>
+        <w:tc>
+          <w:tcPr>
+            <w:tcW w:type="dxa" w:w="2123"/>
+            <w:tcBorders>
+              <w:top w:val="single" w:color="999999" w:sz="4"/>
+              <w:left w:val="single" w:color="999999" w:sz="4"/>
+              <w:bottom w:val="single" w:color="999999" w:sz="4"/>
+              <w:right w:val="single" w:color="999999" w:sz="4"/>
+            </w:tcBorders>
+            <w:tcMar>
+              <w:top w:type="dxa" w:w="60"/>
+              <w:left w:type="dxa" w:w="100"/>
+              <w:bottom w:type="dxa" w:w="60"/>
+              <w:right w:type="dxa" w:w="100"/>
+            </w:tcMar>
+          </w:tcPr>
+          <w:p>
+            <w:pPr>
+              <w:spacing w:line="280"/>
+            </w:pPr>
+            <w:r>
+              <w:rPr>
+                <w:sz w:val="19"/>
+                <w:szCs w:val="19"/>
+              </w:rPr>
+              <w:t xml:space="preserve">尊重して距離を取る</w:t>
+            </w:r>
+          </w:p>
+        </w:tc>
+        <w:tc>
+          <w:tcPr>
+            <w:tcW w:type="dxa" w:w="3088"/>
+            <w:tcBorders>
+              <w:top w:val="single" w:color="999999" w:sz="4"/>
+              <w:left w:val="single" w:color="999999" w:sz="4"/>
+              <w:bottom w:val="single" w:color="999999" w:sz="4"/>
+              <w:right w:val="single" w:color="999999" w:sz="4"/>
+            </w:tcBorders>
+            <w:tcMar>
+              <w:top w:type="dxa" w:w="60"/>
+              <w:left w:type="dxa" w:w="100"/>
+              <w:bottom w:type="dxa" w:w="60"/>
+              <w:right w:type="dxa" w:w="100"/>
+            </w:tcMar>
+          </w:tcPr>
+          <w:p>
+            <w:pPr>
+              <w:spacing w:line="280"/>
+            </w:pPr>
+            <w:r>
+              <w:rPr>
+                <w:sz w:val="19"/>
+                <w:szCs w:val="19"/>
+              </w:rPr>
+              <w:t xml:space="preserve">自分はしないが、相手の文化として尊重する</w:t>
+            </w:r>
+          </w:p>
+        </w:tc>
+        <w:tc>
+          <w:tcPr>
+            <w:tcW w:type="dxa" w:w="3859"/>
+            <w:tcBorders>
+              <w:top w:val="single" w:color="999999" w:sz="4"/>
+              <w:left w:val="single" w:color="999999" w:sz="4"/>
+              <w:bottom w:val="single" w:color="999999" w:sz="4"/>
+              <w:right w:val="single" w:color="999999" w:sz="4"/>
+            </w:tcBorders>
+            <w:tcMar>
+              <w:top w:type="dxa" w:w="60"/>
+              <w:left w:type="dxa" w:w="100"/>
+              <w:bottom w:type="dxa" w:w="60"/>
+              <w:right w:type="dxa" w:w="100"/>
+            </w:tcMar>
+          </w:tcPr>
+          <w:p>
+            <w:pPr>
+              <w:spacing w:line="280"/>
+            </w:pPr>
+            <w:r>
+              <w:rPr>
+                <w:sz w:val="19"/>
+                <w:szCs w:val="19"/>
+              </w:rPr>
+              <w:t xml:space="preserve">宗教上の食事制限を理解し、相手に合わせる</w:t>
+            </w:r>
+          </w:p>
+        </w:tc>
+      </w:tr>
+      <w:tr>
+        <w:trPr>
+          <w:cantSplit/>
+        </w:trPr>
+        <w:tc>
+          <w:tcPr>
+            <w:tcW w:type="dxa" w:w="2123"/>
+            <w:tcBorders>
+              <w:top w:val="single" w:color="999999" w:sz="4"/>
+              <w:left w:val="single" w:color="999999" w:sz="4"/>
+              <w:bottom w:val="single" w:color="999999" w:sz="4"/>
+              <w:right w:val="single" w:color="999999" w:sz="4"/>
+            </w:tcBorders>
+            <w:tcMar>
+              <w:top w:type="dxa" w:w="60"/>
+              <w:left w:type="dxa" w:w="100"/>
+              <w:bottom w:type="dxa" w:w="60"/>
+              <w:right w:type="dxa" w:w="100"/>
+            </w:tcMar>
+          </w:tcPr>
+          <w:p>
+            <w:pPr>
+              <w:spacing w:line="280"/>
+            </w:pPr>
+            <w:r>
+              <w:rPr>
+                <w:sz w:val="19"/>
+                <w:szCs w:val="19"/>
+              </w:rPr>
+              <w:t xml:space="preserve">受け入れられないまま</w:t>
+            </w:r>
+          </w:p>
+        </w:tc>
+        <w:tc>
+          <w:tcPr>
+            <w:tcW w:type="dxa" w:w="3088"/>
+            <w:tcBorders>
+              <w:top w:val="single" w:color="999999" w:sz="4"/>
+              <w:left w:val="single" w:color="999999" w:sz="4"/>
+              <w:bottom w:val="single" w:color="999999" w:sz="4"/>
+              <w:right w:val="single" w:color="999999" w:sz="4"/>
+            </w:tcBorders>
+            <w:tcMar>
+              <w:top w:type="dxa" w:w="60"/>
+              <w:left w:type="dxa" w:w="100"/>
+              <w:bottom w:type="dxa" w:w="60"/>
+              <w:right w:type="dxa" w:w="100"/>
+            </w:tcMar>
+          </w:tcPr>
+          <w:p>
+            <w:pPr>
+              <w:spacing w:line="280"/>
+            </w:pPr>
+            <w:r>
+              <w:rPr>
+                <w:sz w:val="19"/>
+                <w:szCs w:val="19"/>
+              </w:rPr>
+              <w:t xml:space="preserve">時間がたっても納得できない</w:t>
+            </w:r>
+          </w:p>
+        </w:tc>
+        <w:tc>
+          <w:tcPr>
+            <w:tcW w:type="dxa" w:w="3859"/>
+            <w:tcBorders>
+              <w:top w:val="single" w:color="999999" w:sz="4"/>
+              <w:left w:val="single" w:color="999999" w:sz="4"/>
+              <w:bottom w:val="single" w:color="999999" w:sz="4"/>
+              <w:right w:val="single" w:color="999999" w:sz="4"/>
+            </w:tcBorders>
+            <w:tcMar>
+              <w:top w:type="dxa" w:w="60"/>
+              <w:left w:type="dxa" w:w="100"/>
+              <w:bottom w:type="dxa" w:w="60"/>
+              <w:right w:type="dxa" w:w="100"/>
+            </w:tcMar>
+          </w:tcPr>
+          <w:p>
+            <w:pPr>
+              <w:spacing w:line="280"/>
+            </w:pPr>
+            <w:r>
+              <w:rPr>
+                <w:sz w:val="19"/>
+                <w:szCs w:val="19"/>
+              </w:rPr>
+              <w:t xml:space="preserve">飼っていた羊が解体されたことに、今も戸惑いが残る</w:t>
+            </w:r>
+          </w:p>
+        </w:tc>
+      </w:tr>
+    </w:tbl>
+    <w:p>
+      <w:pPr>
+        <w:spacing w:after="120"/>
+      </w:pPr>
+    </w:p>
+    <w:p>
+      <w:pPr>
+        <w:spacing w:after="120" w:line="360"/>
+        <w:ind w:firstLine="210"/>
+      </w:pPr>
+      <w:r>
+        <w:t xml:space="preserve">どの向き合い方も、異文化の中で過ごしていくための一つの形です。本研究では、どのような異文化体験がどの向き合い方につながるのか、何がその分かれ道になるのかを明らかにします。</w:t>
+      </w:r>
+    </w:p>
+    <w:p>
+      <w:pPr>
+        <w:keepNext/>
+        <w:spacing w:after="140" w:before="280"/>
+      </w:pPr>
+      <w:r>
+        <w:rPr>
+          <w:sz w:val="28"/>
+          <w:szCs w:val="28"/>
+        </w:rPr>
         <w:t xml:space="preserve">この研究の新しいところ</w:t>
       </w:r>
     </w:p>
@@ -606,7 +1129,7 @@
         <w:spacing w:after="80" w:line="340"/>
       </w:pPr>
       <w:r>
-        <w:t xml:space="preserve">「適応できた」経験だけでなく、「受け入れられなかった」経験とその向き合い方も扱う</w:t>
+        <w:t xml:space="preserve">「楽しむ」だけでなく、「受け入れる」「尊重して距離を取る」「受け入れられないまま」も含めた、異文化への向き合い方を示す</w:t>
       </w:r>
     </w:p>
     <w:p>

</xml_diff>

<commit_message>
Reword purpose and research question in overview
Co-Authored-By: Claude Opus 5.5 <noreply@anthropic.com>
Claude-Session: https://claude.ai/code/session_01UunSGkA7xxcu1ZJiDN1zG2
</commit_message>
<xml_diff>
--- a/output/卒論の概要.docx
+++ b/output/卒論の概要.docx
@@ -123,7 +123,7 @@
         <w:t xml:space="preserve">目的</w:t>
       </w:r>
       <w:r>
-        <w:t xml:space="preserve">：異文化の衝突を人はどう乗り越えるのか（乗り越えられないときはどう向き合うのか）を明らかにし、これから留学する人が使えるヒントを示すこと。</w:t>
+        <w:t xml:space="preserve">：異文化での戸惑いをどのように乗り越え、その文化を「楽しい」と思える前向きな気持ちになっていくのか（乗り越えられないときはどう向き合うのか）、その過程を明らかにすること。</w:t>
       </w:r>
     </w:p>
     <w:p>
@@ -142,7 +142,7 @@
         <w:t xml:space="preserve">リサーチクエスチョン</w:t>
       </w:r>
       <w:r>
-        <w:t xml:space="preserve">：留学経験者は、異文化の衝突をどのような気づきと行動的工夫によって乗り越えるのか。また、乗り越えられない衝突とはどのように向き合うのか。</w:t>
+        <w:t xml:space="preserve">：留学生は、異文化での戸惑いを、どのような気づきや行動によって乗り越え、楽しめるようになるのか。また、受け入れられない違いとはどのように向き合うのか。</w:t>
       </w:r>
     </w:p>
     <w:p>

</xml_diff>

<commit_message>
Add first-time experiences hypothesis to overview
Co-Authored-By: Claude Opus 5.5 <noreply@anthropic.com>
Claude-Session: https://claude.ai/code/session_01UunSGkA7xxcu1ZJiDN1zG2
</commit_message>
<xml_diff>
--- a/output/卒論の概要.docx
+++ b/output/卒論の概要.docx
@@ -69,7 +69,7 @@
         <w:ind w:firstLine="210"/>
       </w:pPr>
       <w:r>
-        <w:t xml:space="preserve">留学先で異文化に戸惑った人が、どのような過程を経てその文化と向き合い、楽しめるようになっていくのかを明らかにする研究です。筆者のフィジーとベトナムでの経験をもとに、戸惑い→衝突→適応→楽しさという異文化適応のプロセスをたどり、その中で「文化を楽しむ力」がどのように育つのかを描きます。</w:t>
+        <w:t xml:space="preserve">留学先で異文化に戸惑った人が、どのような過程を経てその文化と向き合い、楽しめるようになっていくのかを明らかにする研究です。筆者のフィジーとベトナムでの経験をもとに、戸惑い→衝突→適応→楽しさという異文化適応のプロセスをたどり、その中で「文化を楽しむ力」がどのように育つのかを描きます。特に、「初めてやったこと」を一つずつ積み重ねていくことが、戸惑いを楽しさに変えていくのではないかという点に注目します。</w:t>
       </w:r>
     </w:p>
     <w:p>
@@ -91,7 +91,7 @@
         <w:ind w:firstLine="210"/>
       </w:pPr>
       <w:r>
-        <w:t xml:space="preserve">筆者は高校時代にフィジーで3年間、その後ベトナムで1年間留学しました。フィジーでは、手でカレーを食べる習慣や停電、宗教上の食事制限、飼っていた羊が解体されて食卓に出たことなどに強く戸惑いました。しかし、現地の人に理由を聞いたり、自分でも試してみたりするうちに、戸惑いは少しずつ楽しさに変わっていきました。一方で、時間がたっても受け入れにくい違いもありました。同じ異文化体験でも、楽しめるようになるものと、そうでないものがあるのはなぜか。この疑問が研究の出発点です。</w:t>
+        <w:t xml:space="preserve">筆者は高校時代にフィジーで3年間、その後ベトナムで1年間留学しました。フィジーでは、手でカレーを食べる習慣や停電、宗教上の食事制限、飼っていた羊が解体されて食卓に出たことなどに強く戸惑いました。しかし、「何とかなる」「何事も挑戦だ」と考え、現地の人に理由を聞いたり、スパイスの配合を試したりと、初めてのことに一つずつ挑戦しました。そして、初めてやったことを「やったことリスト」に書き溜めていくうちに、戸惑いは少しずつ楽しさに変わっていきました。一方で、時間がたっても受け入れにくい違いもありました。同じ異文化体験でも、楽しめるようになるものと、そうでないものがあるのはなぜか。この疑問が研究の出発点です。</w:t>
       </w:r>
     </w:p>
     <w:p>
@@ -143,6 +143,40 @@
       </w:r>
       <w:r>
         <w:t xml:space="preserve">：留学生は、異文化での戸惑いを、どのような気づきや行動によって乗り越え、楽しめるようになるのか。また、受け入れられない違いとはどのように向き合うのか。</w:t>
+      </w:r>
+    </w:p>
+    <w:p>
+      <w:pPr>
+        <w:keepNext/>
+        <w:spacing w:after="140" w:before="280"/>
+      </w:pPr>
+      <w:r>
+        <w:rPr>
+          <w:sz w:val="28"/>
+          <w:szCs w:val="28"/>
+        </w:rPr>
+        <w:t xml:space="preserve">本研究の仮説</w:t>
+      </w:r>
+    </w:p>
+    <w:p>
+      <w:pPr>
+        <w:pBdr>
+          <w:left w:val="single" w:color="999999" w:sz="12" w:space="8"/>
+        </w:pBdr>
+        <w:spacing w:after="200" w:before="120" w:line="360"/>
+        <w:ind w:left="420" w:right="420"/>
+      </w:pPr>
+      <w:r>
+        <w:t xml:space="preserve">「初めてやったこと」を一つずつ積み重ね、記録していくことで、異文化への戸惑いが「楽しい」と思える前向きな気持ちに変わっていく。</w:t>
+      </w:r>
+    </w:p>
+    <w:p>
+      <w:pPr>
+        <w:spacing w:after="120" w:line="360"/>
+        <w:ind w:firstLine="210"/>
+      </w:pPr>
+      <w:r>
+        <w:t xml:space="preserve">初めてのことに挑戦するたびに、「できた」という経験が増えていきます。それを書き溜めていくと、自分の変化が目に見えるようになり、次の挑戦への意欲も生まれます。こうした積み重ねが、異文化を「我慢するもの」から「楽しむもの」へと変えていくのではないかと考えます。本研究では、この仮説を筆者の事例から確かめます。</w:t>
       </w:r>
     </w:p>
     <w:p>
@@ -263,7 +297,7 @@
         <w:ind w:firstLine="210"/>
       </w:pPr>
       <w:r>
-        <w:t xml:space="preserve">中心は、筆者自身のフィジーとベトナムでの経験をまとめる事例研究です。当時の記録や写真をもとに、衝突の一つひとつについて、何が起きたか、なぜ起きたか、どう向き合ったか、今どう思うかを整理し、異文化適応のどの段階で起きたのかを位置づけます。あわせて、留学経験のある友人2〜3人に話を聞き、筆者の経験と共通する点や異なる点を確かめます。</w:t>
+        <w:t xml:space="preserve">中心は、筆者自身のフィジーとベトナムでの経験をまとめる事例研究です。「やったことリスト」や当時の写真などの記録をもとに、衝突の一つひとつについて、何が起きたか、なぜ起きたか、どう向き合ったか、今どう思うかを整理し、異文化適応のどの段階で起きたのかを位置づけます。あわせて、留学経験のある友人2〜3人に話を聞き、筆者の経験と共通する点や異なる点を確かめます。</w:t>
       </w:r>
     </w:p>
     <w:p>
@@ -289,7 +323,7 @@
         <w:spacing w:after="80" w:line="340"/>
       </w:pPr>
       <w:r>
-        <w:t xml:space="preserve">異文化適応の各段階で、どのようなきっかけで気持ちや考え方が変わったのかを明らかにする</w:t>
+        <w:t xml:space="preserve">「初めてやったこと」の積み重ねが、異文化適応のどの段階で、どのように気持ちを前向きに変えたのかを明らかにする</w:t>
       </w:r>
     </w:p>
     <w:p>
@@ -315,7 +349,7 @@
         <w:spacing w:after="80" w:line="340"/>
       </w:pPr>
       <w:r>
-        <w:t xml:space="preserve">これらをもとに、これから留学する人が異文化と向き合い、「文化を楽しむ力」を育てるためのヒントをまとめる</w:t>
+        <w:t xml:space="preserve">これらをもとに、これから留学する人が「初めて」を積み重ねながら、「文化を楽しむ力」を育てるためのヒントをまとめる</w:t>
       </w:r>
     </w:p>
     <w:p>

</xml_diff>

<commit_message>
Frame method as case study with comparison interviews
Co-Authored-By: Claude Opus 5.5 <noreply@anthropic.com>
Claude-Session: https://claude.ai/code/session_01UunSGkA7xxcu1ZJiDN1zG2
</commit_message>
<xml_diff>
--- a/output/卒論の概要.docx
+++ b/output/卒論の概要.docx
@@ -297,7 +297,108 @@
         <w:ind w:firstLine="210"/>
       </w:pPr>
       <w:r>
-        <w:t xml:space="preserve">中心は、筆者自身のフィジーとベトナムでの経験をまとめる事例研究です。「やったことリスト」や当時の写真などの記録をもとに、衝突の一つひとつについて、何が起きたか、なぜ起きたか、どう向き合ったか、今どう思うかを整理し、異文化適応のどの段階で起きたのかを位置づけます。あわせて、留学経験のある友人2〜3人に話を聞き、筆者の経験と共通する点や異なる点を確かめます。</w:t>
+        <w:t xml:space="preserve">本研究は、筆者自身のフィジーとベトナムでの経験を中心とする事例研究です。あわせて、筆者の経験を客観的に見直すために、留学経験のある2〜3人にインタビューを行い、筆者の経験と比較します。</w:t>
+      </w:r>
+    </w:p>
+    <w:p>
+      <w:pPr>
+        <w:pStyle w:val="ListParagraph"/>
+        <w:numPr>
+          <w:ilvl w:val="0"/>
+          <w:numId w:val="2"/>
+        </w:numPr>
+        <w:spacing w:after="80" w:line="340"/>
+      </w:pPr>
+      <w:r>
+        <w:rPr>
+          <w:b/>
+          <w:bCs/>
+        </w:rPr>
+        <w:t xml:space="preserve">筆者の事例（中心）</w:t>
+      </w:r>
+      <w:r>
+        <w:t xml:space="preserve">：「やったことリスト」や当時の写真などをもとに、衝突の一つひとつについて、何が起きたか、どう向き合ったか、どの「初めて」が気持ちを変えたかを整理し、異文化適応のどの段階で起きたのかを位置づけます。</w:t>
+      </w:r>
+    </w:p>
+    <w:p>
+      <w:pPr>
+        <w:pStyle w:val="ListParagraph"/>
+        <w:numPr>
+          <w:ilvl w:val="0"/>
+          <w:numId w:val="2"/>
+        </w:numPr>
+        <w:spacing w:after="80" w:line="340"/>
+      </w:pPr>
+      <w:r>
+        <w:rPr>
+          <w:b/>
+          <w:bCs/>
+        </w:rPr>
+        <w:t xml:space="preserve">比較のためのインタビュー</w:t>
+      </w:r>
+      <w:r>
+        <w:t xml:space="preserve">：1人30分程度、あらかじめ決めた質問をもとに自由に話してもらいます（半構造化インタビュー）。</w:t>
+      </w:r>
+    </w:p>
+    <w:p>
+      <w:pPr>
+        <w:pStyle w:val="ListParagraph"/>
+        <w:numPr>
+          <w:ilvl w:val="0"/>
+          <w:numId w:val="3"/>
+        </w:numPr>
+        <w:spacing w:after="80" w:line="340"/>
+      </w:pPr>
+      <w:r>
+        <w:t xml:space="preserve">留学中に一番戸惑ったことは何か</w:t>
+      </w:r>
+    </w:p>
+    <w:p>
+      <w:pPr>
+        <w:pStyle w:val="ListParagraph"/>
+        <w:numPr>
+          <w:ilvl w:val="0"/>
+          <w:numId w:val="3"/>
+        </w:numPr>
+        <w:spacing w:after="80" w:line="340"/>
+      </w:pPr>
+      <w:r>
+        <w:t xml:space="preserve">それをどう乗り越えたか（乗り越えられなかった場合はどう向き合ったか）</w:t>
+      </w:r>
+    </w:p>
+    <w:p>
+      <w:pPr>
+        <w:pStyle w:val="ListParagraph"/>
+        <w:numPr>
+          <w:ilvl w:val="0"/>
+          <w:numId w:val="3"/>
+        </w:numPr>
+        <w:spacing w:after="80" w:line="340"/>
+      </w:pPr>
+      <w:r>
+        <w:t xml:space="preserve">留学中に「初めてやったこと」で、印象に残っていることは何か</w:t>
+      </w:r>
+    </w:p>
+    <w:p>
+      <w:pPr>
+        <w:pStyle w:val="ListParagraph"/>
+        <w:numPr>
+          <w:ilvl w:val="0"/>
+          <w:numId w:val="3"/>
+        </w:numPr>
+        <w:spacing w:after="80" w:line="340"/>
+      </w:pPr>
+      <w:r>
+        <w:t xml:space="preserve">それによって、気持ちや考え方はどう変わったか</w:t>
+      </w:r>
+    </w:p>
+    <w:p>
+      <w:pPr>
+        <w:spacing w:after="120" w:line="360"/>
+        <w:ind w:firstLine="210"/>
+      </w:pPr>
+      <w:r>
+        <w:t xml:space="preserve">筆者の経験とインタビューの内容を並べ、「初めてやったことの積み重ねが楽しさにつながる」という点が共通するのか、それとも人によって違うのかを比べます。共通点があれば仮説の裏づけになり、違いがあれば「文化を楽しむ力」の育ち方の多様さを示すことができます。</w:t>
       </w:r>
     </w:p>
     <w:p>
@@ -886,7 +987,7 @@
                 <w:sz w:val="19"/>
                 <w:szCs w:val="19"/>
               </w:rPr>
-              <w:t xml:space="preserve">自分の事例研究と、友人への聞き取りの進め方</w:t>
+              <w:t xml:space="preserve">筆者の事例研究と、比較のためのインタビューの進め方</w:t>
             </w:r>
           </w:p>
         </w:tc>
@@ -1189,7 +1290,7 @@
                 <w:sz w:val="19"/>
                 <w:szCs w:val="19"/>
               </w:rPr>
-              <w:t xml:space="preserve">自分の経験を整理し、友人2〜3人に話を聞く</w:t>
+              <w:t xml:space="preserve">自分の経験を整理し、留学経験者2〜3人にインタビューする</w:t>
             </w:r>
           </w:p>
         </w:tc>
@@ -1252,7 +1353,7 @@
                 <w:sz w:val="19"/>
                 <w:szCs w:val="19"/>
               </w:rPr>
-              <w:t xml:space="preserve">体験を段階ごとに整理・分析し、結果・考察・結論を書く</w:t>
+              <w:t xml:space="preserve">筆者の経験とインタビューを比較・分析し、結果・考察・結論を書く</w:t>
             </w:r>
           </w:p>
         </w:tc>
@@ -1533,6 +1634,18 @@
       </w:pPr>
     </w:lvl>
   </w:abstractNum>
+  <w:abstractNum w:abstractNumId="3" w15:restartNumberingAfterBreak="0">
+    <w:multiLevelType w:val="hybridMultilevel"/>
+    <w:lvl w:ilvl="0" w15:tentative="1">
+      <w:start w:val="1"/>
+      <w:numFmt w:val="decimal"/>
+      <w:lvlText w:val="%1."/>
+      <w:lvlJc w:val="left"/>
+      <w:pPr>
+        <w:ind w:left="420" w:hanging="320"/>
+      </w:pPr>
+    </w:lvl>
+  </w:abstractNum>
   <w:num w:numId="1">
     <w:abstractNumId w:val="1"/>
     <w:lvlOverride w:ilvl="0">
@@ -1541,6 +1654,12 @@
   </w:num>
   <w:num w:numId="2">
     <w:abstractNumId w:val="2"/>
+    <w:lvlOverride w:ilvl="0">
+      <w:startOverride w:val="1"/>
+    </w:lvlOverride>
+  </w:num>
+  <w:num w:numId="3">
+    <w:abstractNumId w:val="3"/>
     <w:lvlOverride w:ilvl="0">
       <w:startOverride w:val="1"/>
     </w:lvlOverride>

</xml_diff>

<commit_message>
Add analysis of unaccepted experiences and contrasting interviewee to plan
Co-Authored-By: Claude Opus 5.5 <noreply@anthropic.com>
Claude-Session: https://claude.ai/code/session_01UunSGkA7xxcu1ZJiDN1zG2
</commit_message>
<xml_diff>
--- a/output/卒論の概要.docx
+++ b/output/卒論の概要.docx
@@ -1290,7 +1290,7 @@
                 <w:sz w:val="19"/>
                 <w:szCs w:val="19"/>
               </w:rPr>
-              <w:t xml:space="preserve">自分の経験を整理し、留学経験者2〜3人にインタビューする</w:t>
+              <w:t xml:space="preserve">自分の経験を整理する（楽しめた経験だけでなく、受け入れられなかった経験も分析する）。留学経験者2〜3人にインタビューする（うち1人以上は留学がつらかった・なじめなかった人）</w:t>
             </w:r>
           </w:p>
         </w:tc>
@@ -1426,6 +1426,102 @@
       <w:pPr>
         <w:spacing w:after="120"/>
       </w:pPr>
+    </w:p>
+    <w:p>
+      <w:pPr>
+        <w:keepNext/>
+        <w:spacing w:after="80" w:before="200"/>
+      </w:pPr>
+      <w:r>
+        <w:rPr>
+          <w:b/>
+          <w:bCs/>
+        </w:rPr>
+        <w:t xml:space="preserve">自分の「受け入れられなかった経験」も分析する</w:t>
+      </w:r>
+    </w:p>
+    <w:p>
+      <w:pPr>
+        <w:spacing w:after="120" w:line="360"/>
+        <w:ind w:firstLine="210"/>
+      </w:pPr>
+      <w:r>
+        <w:t xml:space="preserve">羊の解体のように、「初めて」を積み重ねても楽しさに変わらなかった経験についても、なぜ変わらなかったのか、それでもどう折り合いをつけたのかを分析します。</w:t>
+      </w:r>
+    </w:p>
+    <w:p>
+      <w:pPr>
+        <w:keepNext/>
+        <w:spacing w:after="80" w:before="200"/>
+      </w:pPr>
+      <w:r>
+        <w:rPr>
+          <w:b/>
+          <w:bCs/>
+        </w:rPr>
+        <w:t xml:space="preserve">インタビューに「楽しめなかった人」を入れる</w:t>
+      </w:r>
+    </w:p>
+    <w:p>
+      <w:pPr>
+        <w:spacing w:after="120" w:line="360"/>
+        <w:ind w:firstLine="210"/>
+      </w:pPr>
+      <w:r>
+        <w:t xml:space="preserve">2〜3人のうち、少なくとも1人は「留学がつらかった」「なじめなかった」という人に話を聞きます。自分と比べて、次の点で何が違ったのかを考えます。</w:t>
+      </w:r>
+    </w:p>
+    <w:p>
+      <w:pPr>
+        <w:pStyle w:val="ListParagraph"/>
+        <w:numPr>
+          <w:ilvl w:val="0"/>
+          <w:numId w:val="2"/>
+        </w:numPr>
+        <w:spacing w:after="80" w:line="340"/>
+      </w:pPr>
+      <w:r>
+        <w:t xml:space="preserve">自分から留学を選んだか、そうでないか</w:t>
+      </w:r>
+    </w:p>
+    <w:p>
+      <w:pPr>
+        <w:pStyle w:val="ListParagraph"/>
+        <w:numPr>
+          <w:ilvl w:val="0"/>
+          <w:numId w:val="2"/>
+        </w:numPr>
+        <w:spacing w:after="80" w:line="340"/>
+      </w:pPr>
+      <w:r>
+        <w:t xml:space="preserve">周りに支えてくれる人がいたか</w:t>
+      </w:r>
+    </w:p>
+    <w:p>
+      <w:pPr>
+        <w:pStyle w:val="ListParagraph"/>
+        <w:numPr>
+          <w:ilvl w:val="0"/>
+          <w:numId w:val="2"/>
+        </w:numPr>
+        <w:spacing w:after="80" w:line="340"/>
+      </w:pPr>
+      <w:r>
+        <w:t xml:space="preserve">衝突の種類（食などの生活面か、価値観や宗教か）</w:t>
+      </w:r>
+    </w:p>
+    <w:p>
+      <w:pPr>
+        <w:pStyle w:val="ListParagraph"/>
+        <w:numPr>
+          <w:ilvl w:val="0"/>
+          <w:numId w:val="2"/>
+        </w:numPr>
+        <w:spacing w:after="80" w:line="340"/>
+      </w:pPr>
+      <w:r>
+        <w:t xml:space="preserve">期間の長さ</w:t>
+      </w:r>
     </w:p>
     <w:sectPr>
       <w:footerReference w:type="default" r:id="rId7"/>

</xml_diff>

<commit_message>
Add everyday-life extension to overview
Co-Authored-By: Claude Opus 5.5 <noreply@anthropic.com>
Claude-Session: https://claude.ai/code/session_01UunSGkA7xxcu1ZJiDN1zG2
</commit_message>
<xml_diff>
--- a/output/卒論の概要.docx
+++ b/output/卒論の概要.docx
@@ -451,6 +451,28 @@
       </w:pPr>
       <w:r>
         <w:t xml:space="preserve">これらをもとに、これから留学する人が「初めて」を積み重ねながら、「文化を楽しむ力」を育てるためのヒントをまとめる</w:t>
+      </w:r>
+    </w:p>
+    <w:p>
+      <w:pPr>
+        <w:keepNext/>
+        <w:spacing w:after="140" w:before="280"/>
+      </w:pPr>
+      <w:r>
+        <w:rPr>
+          <w:sz w:val="28"/>
+          <w:szCs w:val="28"/>
+        </w:rPr>
+        <w:t xml:space="preserve">日常生活への広がり</w:t>
+      </w:r>
+    </w:p>
+    <w:p>
+      <w:pPr>
+        <w:spacing w:after="120" w:line="360"/>
+        <w:ind w:firstLine="210"/>
+      </w:pPr>
+      <w:r>
+        <w:t xml:space="preserve">本研究でいう「異文化」は、国籍の違いに限りません。人はそれぞれ異なる「常識」を持っており、家庭や地域、世代、学校、職場など、日常生活の中でも身近な異文化に出会っています。例えば、家ごとに食事のルールが違ったり、人によって先輩・後輩との距離感が違ったりすることも、その一つです。こうした場面でも、「違いに戸惑う → 理由を知る → 自分なりに向き合う」という流れは同じです。そのため、留学で育まれた「文化を楽しむ力」は、身近な人との違いと向き合うときにも役立つと考えられます。</w:t>
       </w:r>
     </w:p>
     <w:p>

</xml_diff>

<commit_message>
Update overview with mechanism, theory links, and response to feedback
Co-Authored-By: Claude Opus 5.5 <noreply@anthropic.com>
Claude-Session: https://claude.ai/code/session_01UunSGkA7xxcu1ZJiDN1zG2
</commit_message>
<xml_diff>
--- a/output/卒論の概要.docx
+++ b/output/卒論の概要.docx
@@ -176,7 +176,508 @@
         <w:ind w:firstLine="210"/>
       </w:pPr>
       <w:r>
-        <w:t xml:space="preserve">初めてのことに挑戦するたびに、「できた」という経験が増えていきます。それを書き溜めていくと、自分の変化が目に見えるようになり、次の挑戦への意欲も生まれます。こうした積み重ねが、異文化を「我慢するもの」から「楽しむもの」へと変えていくのではないかと考えます。本研究では、この仮説を筆者の事例から確かめます。</w:t>
+        <w:t xml:space="preserve">「初めてやったこと」が楽しさにつながる仕組みは、次の4段階だと考えます。</w:t>
+      </w:r>
+    </w:p>
+    <w:tbl>
+      <w:tblPr>
+        <w:tblW w:type="dxa" w:w="9070"/>
+        <w:tblBorders>
+          <w:top w:val="single" w:color="auto" w:sz="4"/>
+          <w:left w:val="single" w:color="auto" w:sz="4"/>
+          <w:bottom w:val="single" w:color="auto" w:sz="4"/>
+          <w:right w:val="single" w:color="auto" w:sz="4"/>
+          <w:insideH w:val="single" w:color="auto" w:sz="4"/>
+          <w:insideV w:val="single" w:color="auto" w:sz="4"/>
+        </w:tblBorders>
+      </w:tblPr>
+      <w:tblGrid>
+        <w:gridCol w:w="2358"/>
+        <w:gridCol w:w="3628"/>
+        <w:gridCol w:w="3084"/>
+      </w:tblGrid>
+      <w:tr>
+        <w:trPr>
+          <w:tblHeader/>
+        </w:trPr>
+        <w:tc>
+          <w:tcPr>
+            <w:tcW w:type="dxa" w:w="2358"/>
+            <w:tcBorders>
+              <w:top w:val="single" w:color="999999" w:sz="4"/>
+              <w:left w:val="single" w:color="999999" w:sz="4"/>
+              <w:bottom w:val="single" w:color="999999" w:sz="4"/>
+              <w:right w:val="single" w:color="999999" w:sz="4"/>
+            </w:tcBorders>
+            <w:shd w:fill="EDEDED" w:color="auto" w:val="clear"/>
+            <w:tcMar>
+              <w:top w:type="dxa" w:w="60"/>
+              <w:left w:type="dxa" w:w="100"/>
+              <w:bottom w:type="dxa" w:w="60"/>
+              <w:right w:type="dxa" w:w="100"/>
+            </w:tcMar>
+          </w:tcPr>
+          <w:p>
+            <w:pPr>
+              <w:spacing w:line="280"/>
+            </w:pPr>
+            <w:r>
+              <w:rPr>
+                <w:b/>
+                <w:bCs/>
+                <w:sz w:val="19"/>
+                <w:szCs w:val="19"/>
+              </w:rPr>
+              <w:t xml:space="preserve">段階</w:t>
+            </w:r>
+          </w:p>
+        </w:tc>
+        <w:tc>
+          <w:tcPr>
+            <w:tcW w:type="dxa" w:w="3628"/>
+            <w:tcBorders>
+              <w:top w:val="single" w:color="999999" w:sz="4"/>
+              <w:left w:val="single" w:color="999999" w:sz="4"/>
+              <w:bottom w:val="single" w:color="999999" w:sz="4"/>
+              <w:right w:val="single" w:color="999999" w:sz="4"/>
+            </w:tcBorders>
+            <w:shd w:fill="EDEDED" w:color="auto" w:val="clear"/>
+            <w:tcMar>
+              <w:top w:type="dxa" w:w="60"/>
+              <w:left w:type="dxa" w:w="100"/>
+              <w:bottom w:type="dxa" w:w="60"/>
+              <w:right w:type="dxa" w:w="100"/>
+            </w:tcMar>
+          </w:tcPr>
+          <w:p>
+            <w:pPr>
+              <w:spacing w:line="280"/>
+            </w:pPr>
+            <w:r>
+              <w:rPr>
+                <w:b/>
+                <w:bCs/>
+                <w:sz w:val="19"/>
+                <w:szCs w:val="19"/>
+              </w:rPr>
+              <w:t xml:space="preserve">内容</w:t>
+            </w:r>
+          </w:p>
+        </w:tc>
+        <w:tc>
+          <w:tcPr>
+            <w:tcW w:type="dxa" w:w="3084"/>
+            <w:tcBorders>
+              <w:top w:val="single" w:color="999999" w:sz="4"/>
+              <w:left w:val="single" w:color="999999" w:sz="4"/>
+              <w:bottom w:val="single" w:color="999999" w:sz="4"/>
+              <w:right w:val="single" w:color="999999" w:sz="4"/>
+            </w:tcBorders>
+            <w:shd w:fill="EDEDED" w:color="auto" w:val="clear"/>
+            <w:tcMar>
+              <w:top w:type="dxa" w:w="60"/>
+              <w:left w:type="dxa" w:w="100"/>
+              <w:bottom w:type="dxa" w:w="60"/>
+              <w:right w:type="dxa" w:w="100"/>
+            </w:tcMar>
+          </w:tcPr>
+          <w:p>
+            <w:pPr>
+              <w:spacing w:line="280"/>
+            </w:pPr>
+            <w:r>
+              <w:rPr>
+                <w:b/>
+                <w:bCs/>
+                <w:sz w:val="19"/>
+                <w:szCs w:val="19"/>
+              </w:rPr>
+              <w:t xml:space="preserve">筆者の例</w:t>
+            </w:r>
+          </w:p>
+        </w:tc>
+      </w:tr>
+      <w:tr>
+        <w:trPr>
+          <w:cantSplit/>
+        </w:trPr>
+        <w:tc>
+          <w:tcPr>
+            <w:tcW w:type="dxa" w:w="2358"/>
+            <w:tcBorders>
+              <w:top w:val="single" w:color="999999" w:sz="4"/>
+              <w:left w:val="single" w:color="999999" w:sz="4"/>
+              <w:bottom w:val="single" w:color="999999" w:sz="4"/>
+              <w:right w:val="single" w:color="999999" w:sz="4"/>
+            </w:tcBorders>
+            <w:tcMar>
+              <w:top w:type="dxa" w:w="60"/>
+              <w:left w:type="dxa" w:w="100"/>
+              <w:bottom w:type="dxa" w:w="60"/>
+              <w:right w:type="dxa" w:w="100"/>
+            </w:tcMar>
+          </w:tcPr>
+          <w:p>
+            <w:pPr>
+              <w:spacing w:line="280"/>
+            </w:pPr>
+            <w:r>
+              <w:rPr>
+                <w:sz w:val="19"/>
+                <w:szCs w:val="19"/>
+              </w:rPr>
+              <w:t xml:space="preserve">① 挑戦のハードルが下がる</w:t>
+            </w:r>
+          </w:p>
+        </w:tc>
+        <w:tc>
+          <w:tcPr>
+            <w:tcW w:type="dxa" w:w="3628"/>
+            <w:tcBorders>
+              <w:top w:val="single" w:color="999999" w:sz="4"/>
+              <w:left w:val="single" w:color="999999" w:sz="4"/>
+              <w:bottom w:val="single" w:color="999999" w:sz="4"/>
+              <w:right w:val="single" w:color="999999" w:sz="4"/>
+            </w:tcBorders>
+            <w:tcMar>
+              <w:top w:type="dxa" w:w="60"/>
+              <w:left w:type="dxa" w:w="100"/>
+              <w:bottom w:type="dxa" w:w="60"/>
+              <w:right w:type="dxa" w:w="100"/>
+            </w:tcMar>
+          </w:tcPr>
+          <w:p>
+            <w:pPr>
+              <w:spacing w:line="280"/>
+            </w:pPr>
+            <w:r>
+              <w:rPr>
+                <w:sz w:val="19"/>
+                <w:szCs w:val="19"/>
+              </w:rPr>
+              <w:t xml:space="preserve">全部を受け入れるのではなく、「一つだけ試す」なら小さな一歩で済む</w:t>
+            </w:r>
+          </w:p>
+        </w:tc>
+        <w:tc>
+          <w:tcPr>
+            <w:tcW w:type="dxa" w:w="3084"/>
+            <w:tcBorders>
+              <w:top w:val="single" w:color="999999" w:sz="4"/>
+              <w:left w:val="single" w:color="999999" w:sz="4"/>
+              <w:bottom w:val="single" w:color="999999" w:sz="4"/>
+              <w:right w:val="single" w:color="999999" w:sz="4"/>
+            </w:tcBorders>
+            <w:tcMar>
+              <w:top w:type="dxa" w:w="60"/>
+              <w:left w:type="dxa" w:w="100"/>
+              <w:bottom w:type="dxa" w:w="60"/>
+              <w:right w:type="dxa" w:w="100"/>
+            </w:tcMar>
+          </w:tcPr>
+          <w:p>
+            <w:pPr>
+              <w:spacing w:line="280"/>
+            </w:pPr>
+            <w:r>
+              <w:rPr>
+                <w:sz w:val="19"/>
+                <w:szCs w:val="19"/>
+              </w:rPr>
+              <w:t xml:space="preserve">まずスパイスの効能を一つ聞いてみる</w:t>
+            </w:r>
+          </w:p>
+        </w:tc>
+      </w:tr>
+      <w:tr>
+        <w:trPr>
+          <w:cantSplit/>
+        </w:trPr>
+        <w:tc>
+          <w:tcPr>
+            <w:tcW w:type="dxa" w:w="2358"/>
+            <w:tcBorders>
+              <w:top w:val="single" w:color="999999" w:sz="4"/>
+              <w:left w:val="single" w:color="999999" w:sz="4"/>
+              <w:bottom w:val="single" w:color="999999" w:sz="4"/>
+              <w:right w:val="single" w:color="999999" w:sz="4"/>
+            </w:tcBorders>
+            <w:tcMar>
+              <w:top w:type="dxa" w:w="60"/>
+              <w:left w:type="dxa" w:w="100"/>
+              <w:bottom w:type="dxa" w:w="60"/>
+              <w:right w:type="dxa" w:w="100"/>
+            </w:tcMar>
+          </w:tcPr>
+          <w:p>
+            <w:pPr>
+              <w:spacing w:line="280"/>
+            </w:pPr>
+            <w:r>
+              <w:rPr>
+                <w:sz w:val="19"/>
+                <w:szCs w:val="19"/>
+              </w:rPr>
+              <w:t xml:space="preserve">② 「できた」が目に見える</w:t>
+            </w:r>
+          </w:p>
+        </w:tc>
+        <w:tc>
+          <w:tcPr>
+            <w:tcW w:type="dxa" w:w="3628"/>
+            <w:tcBorders>
+              <w:top w:val="single" w:color="999999" w:sz="4"/>
+              <w:left w:val="single" w:color="999999" w:sz="4"/>
+              <w:bottom w:val="single" w:color="999999" w:sz="4"/>
+              <w:right w:val="single" w:color="999999" w:sz="4"/>
+            </w:tcBorders>
+            <w:tcMar>
+              <w:top w:type="dxa" w:w="60"/>
+              <w:left w:type="dxa" w:w="100"/>
+              <w:bottom w:type="dxa" w:w="60"/>
+              <w:right w:type="dxa" w:w="100"/>
+            </w:tcMar>
+          </w:tcPr>
+          <w:p>
+            <w:pPr>
+              <w:spacing w:line="280"/>
+            </w:pPr>
+            <w:r>
+              <w:rPr>
+                <w:sz w:val="19"/>
+                <w:szCs w:val="19"/>
+              </w:rPr>
+              <w:t xml:space="preserve">リストに書き溜めることで成長がわかり、自信がつく</w:t>
+            </w:r>
+          </w:p>
+        </w:tc>
+        <w:tc>
+          <w:tcPr>
+            <w:tcW w:type="dxa" w:w="3084"/>
+            <w:tcBorders>
+              <w:top w:val="single" w:color="999999" w:sz="4"/>
+              <w:left w:val="single" w:color="999999" w:sz="4"/>
+              <w:bottom w:val="single" w:color="999999" w:sz="4"/>
+              <w:right w:val="single" w:color="999999" w:sz="4"/>
+            </w:tcBorders>
+            <w:tcMar>
+              <w:top w:type="dxa" w:w="60"/>
+              <w:left w:type="dxa" w:w="100"/>
+              <w:bottom w:type="dxa" w:w="60"/>
+              <w:right w:type="dxa" w:w="100"/>
+            </w:tcMar>
+          </w:tcPr>
+          <w:p>
+            <w:pPr>
+              <w:spacing w:line="280"/>
+            </w:pPr>
+            <w:r>
+              <w:rPr>
+                <w:sz w:val="19"/>
+                <w:szCs w:val="19"/>
+              </w:rPr>
+              <w:t xml:space="preserve">リストを見て、できることが増えたと感じる</w:t>
+            </w:r>
+          </w:p>
+        </w:tc>
+      </w:tr>
+      <w:tr>
+        <w:trPr>
+          <w:cantSplit/>
+        </w:trPr>
+        <w:tc>
+          <w:tcPr>
+            <w:tcW w:type="dxa" w:w="2358"/>
+            <w:tcBorders>
+              <w:top w:val="single" w:color="999999" w:sz="4"/>
+              <w:left w:val="single" w:color="999999" w:sz="4"/>
+              <w:bottom w:val="single" w:color="999999" w:sz="4"/>
+              <w:right w:val="single" w:color="999999" w:sz="4"/>
+            </w:tcBorders>
+            <w:tcMar>
+              <w:top w:type="dxa" w:w="60"/>
+              <w:left w:type="dxa" w:w="100"/>
+              <w:bottom w:type="dxa" w:w="60"/>
+              <w:right w:type="dxa" w:w="100"/>
+            </w:tcMar>
+          </w:tcPr>
+          <w:p>
+            <w:pPr>
+              <w:spacing w:line="280"/>
+            </w:pPr>
+            <w:r>
+              <w:rPr>
+                <w:sz w:val="19"/>
+                <w:szCs w:val="19"/>
+              </w:rPr>
+              <w:t xml:space="preserve">③ 戸惑いが挑戦の材料に変わる</w:t>
+            </w:r>
+          </w:p>
+        </w:tc>
+        <w:tc>
+          <w:tcPr>
+            <w:tcW w:type="dxa" w:w="3628"/>
+            <w:tcBorders>
+              <w:top w:val="single" w:color="999999" w:sz="4"/>
+              <w:left w:val="single" w:color="999999" w:sz="4"/>
+              <w:bottom w:val="single" w:color="999999" w:sz="4"/>
+              <w:right w:val="single" w:color="999999" w:sz="4"/>
+            </w:tcBorders>
+            <w:tcMar>
+              <w:top w:type="dxa" w:w="60"/>
+              <w:left w:type="dxa" w:w="100"/>
+              <w:bottom w:type="dxa" w:w="60"/>
+              <w:right w:type="dxa" w:w="100"/>
+            </w:tcMar>
+          </w:tcPr>
+          <w:p>
+            <w:pPr>
+              <w:spacing w:line="280"/>
+            </w:pPr>
+            <w:r>
+              <w:rPr>
+                <w:sz w:val="19"/>
+                <w:szCs w:val="19"/>
+              </w:rPr>
+              <w:t xml:space="preserve">嫌なことが「次にやってみること」に見えてくる</w:t>
+            </w:r>
+          </w:p>
+        </w:tc>
+        <w:tc>
+          <w:tcPr>
+            <w:tcW w:type="dxa" w:w="3084"/>
+            <w:tcBorders>
+              <w:top w:val="single" w:color="999999" w:sz="4"/>
+              <w:left w:val="single" w:color="999999" w:sz="4"/>
+              <w:bottom w:val="single" w:color="999999" w:sz="4"/>
+              <w:right w:val="single" w:color="999999" w:sz="4"/>
+            </w:tcBorders>
+            <w:tcMar>
+              <w:top w:type="dxa" w:w="60"/>
+              <w:left w:type="dxa" w:w="100"/>
+              <w:bottom w:type="dxa" w:w="60"/>
+              <w:right w:type="dxa" w:w="100"/>
+            </w:tcMar>
+          </w:tcPr>
+          <w:p>
+            <w:pPr>
+              <w:spacing w:line="280"/>
+            </w:pPr>
+            <w:r>
+              <w:rPr>
+                <w:sz w:val="19"/>
+                <w:szCs w:val="19"/>
+              </w:rPr>
+              <w:t xml:space="preserve">三食カレーが「自分で配合してみよう」に変わる</w:t>
+            </w:r>
+          </w:p>
+        </w:tc>
+      </w:tr>
+      <w:tr>
+        <w:trPr>
+          <w:cantSplit/>
+        </w:trPr>
+        <w:tc>
+          <w:tcPr>
+            <w:tcW w:type="dxa" w:w="2358"/>
+            <w:tcBorders>
+              <w:top w:val="single" w:color="999999" w:sz="4"/>
+              <w:left w:val="single" w:color="999999" w:sz="4"/>
+              <w:bottom w:val="single" w:color="999999" w:sz="4"/>
+              <w:right w:val="single" w:color="999999" w:sz="4"/>
+            </w:tcBorders>
+            <w:tcMar>
+              <w:top w:type="dxa" w:w="60"/>
+              <w:left w:type="dxa" w:w="100"/>
+              <w:bottom w:type="dxa" w:w="60"/>
+              <w:right w:type="dxa" w:w="100"/>
+            </w:tcMar>
+          </w:tcPr>
+          <w:p>
+            <w:pPr>
+              <w:spacing w:line="280"/>
+            </w:pPr>
+            <w:r>
+              <w:rPr>
+                <w:sz w:val="19"/>
+                <w:szCs w:val="19"/>
+              </w:rPr>
+              <w:t xml:space="preserve">④ 人とのつながりが増える</w:t>
+            </w:r>
+          </w:p>
+        </w:tc>
+        <w:tc>
+          <w:tcPr>
+            <w:tcW w:type="dxa" w:w="3628"/>
+            <w:tcBorders>
+              <w:top w:val="single" w:color="999999" w:sz="4"/>
+              <w:left w:val="single" w:color="999999" w:sz="4"/>
+              <w:bottom w:val="single" w:color="999999" w:sz="4"/>
+              <w:right w:val="single" w:color="999999" w:sz="4"/>
+            </w:tcBorders>
+            <w:tcMar>
+              <w:top w:type="dxa" w:w="60"/>
+              <w:left w:type="dxa" w:w="100"/>
+              <w:bottom w:type="dxa" w:w="60"/>
+              <w:right w:type="dxa" w:w="100"/>
+            </w:tcMar>
+          </w:tcPr>
+          <w:p>
+            <w:pPr>
+              <w:spacing w:line="280"/>
+            </w:pPr>
+            <w:r>
+              <w:rPr>
+                <w:sz w:val="19"/>
+                <w:szCs w:val="19"/>
+              </w:rPr>
+              <w:t xml:space="preserve">初めてのことを教わる中で会話が生まれる</w:t>
+            </w:r>
+          </w:p>
+        </w:tc>
+        <w:tc>
+          <w:tcPr>
+            <w:tcW w:type="dxa" w:w="3084"/>
+            <w:tcBorders>
+              <w:top w:val="single" w:color="999999" w:sz="4"/>
+              <w:left w:val="single" w:color="999999" w:sz="4"/>
+              <w:bottom w:val="single" w:color="999999" w:sz="4"/>
+              <w:right w:val="single" w:color="999999" w:sz="4"/>
+            </w:tcBorders>
+            <w:tcMar>
+              <w:top w:type="dxa" w:w="60"/>
+              <w:left w:type="dxa" w:w="100"/>
+              <w:bottom w:type="dxa" w:w="60"/>
+              <w:right w:type="dxa" w:w="100"/>
+            </w:tcMar>
+          </w:tcPr>
+          <w:p>
+            <w:pPr>
+              <w:spacing w:line="280"/>
+            </w:pPr>
+            <w:r>
+              <w:rPr>
+                <w:sz w:val="19"/>
+                <w:szCs w:val="19"/>
+              </w:rPr>
+              <w:t xml:space="preserve">ホストファミリーと話す機会が増える</w:t>
+            </w:r>
+          </w:p>
+        </w:tc>
+      </w:tr>
+    </w:tbl>
+    <w:p>
+      <w:pPr>
+        <w:spacing w:after="120"/>
+      </w:pPr>
+    </w:p>
+    <w:p>
+      <w:pPr>
+        <w:spacing w:after="120" w:line="360"/>
+        <w:ind w:firstLine="210"/>
+      </w:pPr>
+      <w:r>
+        <w:t xml:space="preserve">この流れがくり返されるうちに、「違い＝戸惑い」が「違い＝面白い」に変わっていくと考えます。本研究では、この仮説を筆者の事例から確かめます。</w:t>
       </w:r>
     </w:p>
     <w:p>
@@ -211,6 +712,50 @@
       </w:pPr>
       <w:r>
         <w:t xml:space="preserve">従来の異文化適応の理論（Uカーブモデルなど）は、「適応できたかどうか」をゴールにしています。本研究では、その先にある「楽しむ」段階に注目します。ただし、楽しむことだけを正解とはしません。違いを受け入れられないときに、どう折り合いをつけて過ごしたのかも、この力の一部として捉えます。</w:t>
+      </w:r>
+    </w:p>
+    <w:p>
+      <w:pPr>
+        <w:keepNext/>
+        <w:spacing w:after="140" w:before="280"/>
+      </w:pPr>
+      <w:r>
+        <w:rPr>
+          <w:sz w:val="28"/>
+          <w:szCs w:val="28"/>
+        </w:rPr>
+        <w:t xml:space="preserve">先行研究とのつながり</w:t>
+      </w:r>
+    </w:p>
+    <w:p>
+      <w:pPr>
+        <w:spacing w:after="120" w:line="360"/>
+        <w:ind w:firstLine="210"/>
+      </w:pPr>
+      <w:r>
+        <w:t xml:space="preserve">Uカーブモデル（Lysgaard 1955）やオバーグ（Oberg 1960）は、異文化の中で気持ちが「いつ」「どう」変わるかを示しました。ホール（Hall 1976）やホフステード（Hofstede et al. 2010）は、文化の違いから「なぜ」「どんな」衝突が起きるのかを説明しています。しかし、戸惑いがどうやって「楽しい」に変わるのかは、どの理論も説明していません。本研究は、その空白を「初めて」の積み重ねという視点から埋めることを目指します。</w:t>
+      </w:r>
+    </w:p>
+    <w:p>
+      <w:pPr>
+        <w:keepNext/>
+        <w:spacing w:after="140" w:before="280"/>
+      </w:pPr>
+      <w:r>
+        <w:rPr>
+          <w:sz w:val="28"/>
+          <w:szCs w:val="28"/>
+        </w:rPr>
+        <w:t xml:space="preserve">全員が楽しめるわけではない</w:t>
+      </w:r>
+    </w:p>
+    <w:p>
+      <w:pPr>
+        <w:spacing w:after="120" w:line="360"/>
+        <w:ind w:firstLine="210"/>
+      </w:pPr>
+      <w:r>
+        <w:t xml:space="preserve">筆者自身も、すべての違いを受け入れられたわけではありません。羊の解体は、今でも受け入れられていません。そのため本研究は、「誰でも適応できる」と主張するものではありません。楽しめた違いと受け入れられなかった違いは何が違ったのか、その分かれ道を明らかにすることを目指します。そのために、楽しめなかった人にもインタビューを行い、4段階のどこで止まったのかを比べます。また、受け入れられないときは、無理に受け入れず相手の文化として尊重するという向き合い方も含めて示します。</w:t>
       </w:r>
     </w:p>
     <w:p>
@@ -472,7 +1017,7 @@
         <w:ind w:firstLine="210"/>
       </w:pPr>
       <w:r>
-        <w:t xml:space="preserve">本研究でいう「異文化」は、国籍の違いに限りません。人はそれぞれ異なる「常識」を持っており、家庭や地域、世代、学校、職場など、日常生活の中でも身近な異文化に出会っています。例えば、家ごとに食事のルールが違ったり、人によって先輩・後輩との距離感が違ったりすることも、その一つです。こうした場面でも、「違いに戸惑う → 理由を知る → 自分なりに向き合う」という流れは同じです。そのため、留学で育まれた「文化を楽しむ力」は、身近な人との違いと向き合うときにも役立つと考えられます。</w:t>
+        <w:t xml:space="preserve">本研究でいう「異文化」は、国の違いだけではありません。同じ日本人でも、家庭や世代が違えば「常識」は異なり、それも身近な異文化と言えます。違いに戸惑い、理由を知り、自分なりに向き合うという流れは、留学でも日常でも同じです。したがって「文化を楽しむ力」は、人と人との常識の違いと向き合う際にも役立つと考えられます。</w:t>
       </w:r>
     </w:p>
     <w:p>

</xml_diff>